<commit_message>
Fix ЛР6: tie revenue to $480/year, add missing scenario families
Council audit found the Canvas revenue block had no dollar figure at all
(never reconciled with lab2-3's $480/year), user scenarios covered only
1 of ~9 required families, and pages/screens were a flat list reverse-
fitted from existing mockups instead of derived from scenarios. Fixed:
revenue now cites $480/year explicitly; added monetization/discovery/
retention/error-recovery scenarios (2 in full 14-field passport format);
added a scenario-to-screen matrix that surfaced a genuinely missing
screen (pricing/payment) now added to release 1; added the 8 required
interface states; added qualitative release-priority scoring.
</commit_message>
<xml_diff>
--- a/labs/lab6-canvas-releases/ЛР6_Канвас_Релизы_DiagramCode.docx
+++ b/labs/lab6-canvas-releases/ЛР6_Канвас_Релизы_DiagramCode.docx
@@ -55,6 +55,18 @@
     </w:p>
     <w:p>
       <w:pPr>
+        <w:spacing w:after="120"/>
+      </w:pPr>
+      <w:r>
+        <w:rPr>
+          <w:i/>
+          <w:iCs/>
+        </w:rPr>
+        <w:t xml:space="preserve">**Исправлено после ревизии совета**: (1) в Канвасе «Потоки доходов» не было ни одной цифры — теперь явно указан $480/год из ЛР2-3; (2) пользовательские сценарии закрывали только одно из девяти требуемых методикой семейств («получение ценности») — добавлены сценарии монетизации, доверия, удержания и восстановления после ошибки, два из них — в полном 14-польном формате «паспорта сценария»; (3) страницы/экраны были просто списком из готовых макетов продукта, без связи со сценариями и без состояний интерфейса — добавлена матрица «сценарий → экран» и таблица состояний.</w:t>
+      </w:r>
+    </w:p>
+    <w:p>
+      <w:pPr>
         <w:pStyle w:val="Heading1"/>
         <w:spacing w:after="120" w:before="240"/>
       </w:pPr>
@@ -627,7 +639,17 @@
           </w:tcPr>
           <w:p>
             <w:r>
-              <w:t xml:space="preserve">Подписка по местам с AI-квотой на тариф (см. раздел 1)</w:t>
+              <w:t xml:space="preserve">Подписка по местам с AI-квотой на тариф: рабочее допущение </w:t>
+            </w:r>
+            <w:r>
+              <w:rPr>
+                <w:b/>
+                <w:bCs/>
+              </w:rPr>
+              <w:t xml:space="preserve">$8/участник/мес ≈ $480/год на платящую компанию</w:t>
+            </w:r>
+            <w:r>
+              <w:t xml:space="preserve"> (5 человек в команде-адептере, обоснование и весь расчёт — ЛР2-3, раздел 4) — та же цифра, что использована во всех рыночных расчётах, без расхождений</w:t>
             </w:r>
           </w:p>
         </w:tc>
@@ -969,6 +991,15 @@
         <w:t xml:space="preserve">3. Бизнес-логика и пользовательские сценарии</w:t>
       </w:r>
     </w:p>
+    <w:p>
+      <w:pPr>
+        <w:pStyle w:val="Heading2"/>
+        <w:spacing w:after="100" w:before="200"/>
+      </w:pPr>
+      <w:r>
+        <w:t xml:space="preserve">3.1. Обзорная матрица по ролям (все 3 исходных сценария + 4 новых, закрывающих недостающие семейства методики)</w:t>
+      </w:r>
+    </w:p>
     <w:tbl>
       <w:tblPr>
         <w:tblW w:type="dxa" w:w="9638"/>
@@ -982,11 +1013,12 @@
         </w:tblBorders>
       </w:tblPr>
       <w:tblGrid>
-        <w:gridCol w:w="1927"/>
-        <w:gridCol w:w="1927"/>
-        <w:gridCol w:w="1927"/>
-        <w:gridCol w:w="1927"/>
-        <w:gridCol w:w="1927"/>
+        <w:gridCol w:w="1606"/>
+        <w:gridCol w:w="1606"/>
+        <w:gridCol w:w="1606"/>
+        <w:gridCol w:w="1606"/>
+        <w:gridCol w:w="1606"/>
+        <w:gridCol w:w="1606"/>
       </w:tblGrid>
       <w:tr>
         <w:trPr>
@@ -994,7 +1026,7 @@
         </w:trPr>
         <w:tc>
           <w:tcPr>
-            <w:tcW w:type="dxa" w:w="1927"/>
+            <w:tcW w:type="dxa" w:w="1606"/>
             <w:shd w:fill="D9D9D9" w:val="clear"/>
           </w:tcPr>
           <w:p>
@@ -1009,7 +1041,7 @@
         </w:tc>
         <w:tc>
           <w:tcPr>
-            <w:tcW w:type="dxa" w:w="1927"/>
+            <w:tcW w:type="dxa" w:w="1606"/>
             <w:shd w:fill="D9D9D9" w:val="clear"/>
           </w:tcPr>
           <w:p>
@@ -1024,7 +1056,7 @@
         </w:tc>
         <w:tc>
           <w:tcPr>
-            <w:tcW w:type="dxa" w:w="1927"/>
+            <w:tcW w:type="dxa" w:w="1606"/>
             <w:shd w:fill="D9D9D9" w:val="clear"/>
           </w:tcPr>
           <w:p>
@@ -1039,7 +1071,7 @@
         </w:tc>
         <w:tc>
           <w:tcPr>
-            <w:tcW w:type="dxa" w:w="1927"/>
+            <w:tcW w:type="dxa" w:w="1606"/>
             <w:shd w:fill="D9D9D9" w:val="clear"/>
           </w:tcPr>
           <w:p>
@@ -1054,7 +1086,7 @@
         </w:tc>
         <w:tc>
           <w:tcPr>
-            <w:tcW w:type="dxa" w:w="1927"/>
+            <w:tcW w:type="dxa" w:w="1606"/>
             <w:shd w:fill="D9D9D9" w:val="clear"/>
           </w:tcPr>
           <w:p>
@@ -1067,11 +1099,95 @@
             </w:r>
           </w:p>
         </w:tc>
-      </w:tr>
-      <w:tr>
-        <w:tc>
-          <w:tcPr>
-            <w:tcW w:type="dxa" w:w="1927"/>
+        <w:tc>
+          <w:tcPr>
+            <w:tcW w:type="dxa" w:w="1606"/>
+            <w:shd w:fill="D9D9D9" w:val="clear"/>
+          </w:tcPr>
+          <w:p>
+            <w:r>
+              <w:rPr>
+                <w:b/>
+                <w:bCs/>
+              </w:rPr>
+              <w:t xml:space="preserve">Семейство (методика §9)</w:t>
+            </w:r>
+          </w:p>
+        </w:tc>
+      </w:tr>
+      <w:tr>
+        <w:tc>
+          <w:tcPr>
+            <w:tcW w:type="dxa" w:w="1606"/>
+          </w:tcPr>
+          <w:p>
+            <w:r>
+              <w:t xml:space="preserve">Посетитель (ещё не зарегистрирован)</w:t>
+            </w:r>
+          </w:p>
+        </w:tc>
+        <w:tc>
+          <w:tcPr>
+            <w:tcW w:type="dxa" w:w="1606"/>
+          </w:tcPr>
+          <w:p>
+            <w:r>
+              <w:t xml:space="preserve">Понять, подходит ли инструмент, прежде чем регистрироваться</w:t>
+            </w:r>
+          </w:p>
+        </w:tc>
+        <w:tc>
+          <w:tcPr>
+            <w:tcW w:type="dxa" w:w="1606"/>
+          </w:tcPr>
+          <w:p>
+            <w:r>
+              <w:t xml:space="preserve">Найти DiagramCode через поиск/GitHub → открыть лендинг/документацию → сравнить с PlantUML/Eraser.io</w:t>
+            </w:r>
+          </w:p>
+        </w:tc>
+        <w:tc>
+          <w:tcPr>
+            <w:tcW w:type="dxa" w:w="1606"/>
+          </w:tcPr>
+          <w:p>
+            <w:r>
+              <w:t xml:space="preserve">Снижение риска «зря потратить время на регистрацию»</w:t>
+            </w:r>
+          </w:p>
+        </w:tc>
+        <w:tc>
+          <w:tcPr>
+            <w:tcW w:type="dxa" w:w="1606"/>
+          </w:tcPr>
+          <w:p>
+            <w:r>
+              <w:t xml:space="preserve">Верхняя часть воронки — не платит, но конвертируется дальше</w:t>
+            </w:r>
+          </w:p>
+        </w:tc>
+        <w:tc>
+          <w:tcPr>
+            <w:tcW w:type="dxa" w:w="1606"/>
+          </w:tcPr>
+          <w:p>
+            <w:r>
+              <w:rPr>
+                <w:b/>
+                <w:bCs/>
+              </w:rPr>
+              <w:t xml:space="preserve">Discovery / доверие-сравнение</w:t>
+            </w:r>
+            <w:r>
+              <w:t xml:space="preserve"> (новое)</w:t>
+            </w:r>
+          </w:p>
+        </w:tc>
+      </w:tr>
+      <w:tr>
+        <w:tc>
+          <w:tcPr>
+            <w:tcW w:type="dxa" w:w="1606"/>
           </w:tcPr>
           <w:p>
             <w:r>
@@ -1081,7 +1197,7 @@
         </w:tc>
         <w:tc>
           <w:tcPr>
-            <w:tcW w:type="dxa" w:w="1927"/>
+            <w:tcW w:type="dxa" w:w="1606"/>
           </w:tcPr>
           <w:p>
             <w:r>
@@ -1091,7 +1207,7 @@
         </w:tc>
         <w:tc>
           <w:tcPr>
-            <w:tcW w:type="dxa" w:w="1927"/>
+            <w:tcW w:type="dxa" w:w="1606"/>
           </w:tcPr>
           <w:p>
             <w:r>
@@ -1101,7 +1217,7 @@
         </w:tc>
         <w:tc>
           <w:tcPr>
-            <w:tcW w:type="dxa" w:w="1927"/>
+            <w:tcW w:type="dxa" w:w="1606"/>
           </w:tcPr>
           <w:p>
             <w:r>
@@ -1111,19 +1227,29 @@
         </w:tc>
         <w:tc>
           <w:tcPr>
-            <w:tcW w:type="dxa" w:w="1927"/>
-          </w:tcPr>
-          <w:p>
-            <w:r>
-              <w:t xml:space="preserve">Оплата за AI-квоту сверх бесплатного лимита</w:t>
-            </w:r>
-          </w:p>
-        </w:tc>
-      </w:tr>
-      <w:tr>
-        <w:tc>
-          <w:tcPr>
-            <w:tcW w:type="dxa" w:w="1927"/>
+            <w:tcW w:type="dxa" w:w="1606"/>
+          </w:tcPr>
+          <w:p>
+            <w:r>
+              <w:t xml:space="preserve">Ядро продукта, бесплатный лимит</w:t>
+            </w:r>
+          </w:p>
+        </w:tc>
+        <w:tc>
+          <w:tcPr>
+            <w:tcW w:type="dxa" w:w="1606"/>
+          </w:tcPr>
+          <w:p>
+            <w:r>
+              <w:t xml:space="preserve">Ядро ценности</w:t>
+            </w:r>
+          </w:p>
+        </w:tc>
+      </w:tr>
+      <w:tr>
+        <w:tc>
+          <w:tcPr>
+            <w:tcW w:type="dxa" w:w="1606"/>
           </w:tcPr>
           <w:p>
             <w:r>
@@ -1133,7 +1259,7 @@
         </w:tc>
         <w:tc>
           <w:tcPr>
-            <w:tcW w:type="dxa" w:w="1927"/>
+            <w:tcW w:type="dxa" w:w="1606"/>
           </w:tcPr>
           <w:p>
             <w:r>
@@ -1143,7 +1269,7 @@
         </w:tc>
         <w:tc>
           <w:tcPr>
-            <w:tcW w:type="dxa" w:w="1927"/>
+            <w:tcW w:type="dxa" w:w="1606"/>
           </w:tcPr>
           <w:p>
             <w:r>
@@ -1153,7 +1279,7 @@
         </w:tc>
         <w:tc>
           <w:tcPr>
-            <w:tcW w:type="dxa" w:w="1927"/>
+            <w:tcW w:type="dxa" w:w="1606"/>
           </w:tcPr>
           <w:p>
             <w:r>
@@ -1163,19 +1289,243 @@
         </w:tc>
         <w:tc>
           <w:tcPr>
-            <w:tcW w:type="dxa" w:w="1927"/>
-          </w:tcPr>
-          <w:p>
-            <w:r>
-              <w:t xml:space="preserve">Прямой источник платной AI-квоты</w:t>
-            </w:r>
-          </w:p>
-        </w:tc>
-      </w:tr>
-      <w:tr>
-        <w:tc>
-          <w:tcPr>
-            <w:tcW w:type="dxa" w:w="1927"/>
+            <w:tcW w:type="dxa" w:w="1606"/>
+          </w:tcPr>
+          <w:p>
+            <w:r>
+              <w:t xml:space="preserve">Прямой источник расхода AI-квоты</w:t>
+            </w:r>
+          </w:p>
+        </w:tc>
+        <w:tc>
+          <w:tcPr>
+            <w:tcW w:type="dxa" w:w="1606"/>
+          </w:tcPr>
+          <w:p>
+            <w:r>
+              <w:t xml:space="preserve">Ядро ценности</w:t>
+            </w:r>
+          </w:p>
+        </w:tc>
+      </w:tr>
+      <w:tr>
+        <w:tc>
+          <w:tcPr>
+            <w:tcW w:type="dxa" w:w="1606"/>
+          </w:tcPr>
+          <w:p>
+            <w:r>
+              <w:t xml:space="preserve">Пользователь, исчерпавший AI-квоту</w:t>
+            </w:r>
+          </w:p>
+        </w:tc>
+        <w:tc>
+          <w:tcPr>
+            <w:tcW w:type="dxa" w:w="1606"/>
+          </w:tcPr>
+          <w:p>
+            <w:r>
+              <w:t xml:space="preserve">Продолжить пользоваться AI сверх бесплатного лимита</w:t>
+            </w:r>
+          </w:p>
+        </w:tc>
+        <w:tc>
+          <w:tcPr>
+            <w:tcW w:type="dxa" w:w="1606"/>
+          </w:tcPr>
+          <w:p>
+            <w:r>
+              <w:t xml:space="preserve">Получить уведомление об исчерпании квоты → увидеть тарифы → оплатить подписку</w:t>
+            </w:r>
+          </w:p>
+        </w:tc>
+        <w:tc>
+          <w:tcPr>
+            <w:tcW w:type="dxa" w:w="1606"/>
+          </w:tcPr>
+          <w:p>
+            <w:r>
+              <w:t xml:space="preserve">Непрерывность работы без потери прогресса</w:t>
+            </w:r>
+          </w:p>
+        </w:tc>
+        <w:tc>
+          <w:tcPr>
+            <w:tcW w:type="dxa" w:w="1606"/>
+          </w:tcPr>
+          <w:p>
+            <w:r>
+              <w:rPr>
+                <w:b/>
+                <w:bCs/>
+              </w:rPr>
+              <w:t xml:space="preserve">Прямая точка монетизации</w:t>
+            </w:r>
+            <w:r>
+              <w:t xml:space="preserve"> — паспорт ниже</w:t>
+            </w:r>
+          </w:p>
+        </w:tc>
+        <w:tc>
+          <w:tcPr>
+            <w:tcW w:type="dxa" w:w="1606"/>
+          </w:tcPr>
+          <w:p>
+            <w:r>
+              <w:rPr>
+                <w:b/>
+                <w:bCs/>
+              </w:rPr>
+              <w:t xml:space="preserve">Монетизация</w:t>
+            </w:r>
+            <w:r>
+              <w:t xml:space="preserve"> (новое)</w:t>
+            </w:r>
+          </w:p>
+        </w:tc>
+      </w:tr>
+      <w:tr>
+        <w:tc>
+          <w:tcPr>
+            <w:tcW w:type="dxa" w:w="1606"/>
+          </w:tcPr>
+          <w:p>
+            <w:r>
+              <w:t xml:space="preserve">Пользователь через месяц использования</w:t>
+            </w:r>
+          </w:p>
+        </w:tc>
+        <w:tc>
+          <w:tcPr>
+            <w:tcW w:type="dxa" w:w="1606"/>
+          </w:tcPr>
+          <w:p>
+            <w:r>
+              <w:t xml:space="preserve">Продолжать возвращаться к продукту</w:t>
+            </w:r>
+          </w:p>
+        </w:tc>
+        <w:tc>
+          <w:tcPr>
+            <w:tcW w:type="dxa" w:w="1606"/>
+          </w:tcPr>
+          <w:p>
+            <w:r>
+              <w:t xml:space="preserve">Открыть сохранённую диаграмму → увидеть историю версий → внести изменения</w:t>
+            </w:r>
+          </w:p>
+        </w:tc>
+        <w:tc>
+          <w:tcPr>
+            <w:tcW w:type="dxa" w:w="1606"/>
+          </w:tcPr>
+          <w:p>
+            <w:r>
+              <w:t xml:space="preserve">Накопленная ценность (история, привычка) удерживает от перехода к конкуренту</w:t>
+            </w:r>
+          </w:p>
+        </w:tc>
+        <w:tc>
+          <w:tcPr>
+            <w:tcW w:type="dxa" w:w="1606"/>
+          </w:tcPr>
+          <w:p>
+            <w:r>
+              <w:t xml:space="preserve">Снижает отток платящих мест</w:t>
+            </w:r>
+          </w:p>
+        </w:tc>
+        <w:tc>
+          <w:tcPr>
+            <w:tcW w:type="dxa" w:w="1606"/>
+          </w:tcPr>
+          <w:p>
+            <w:r>
+              <w:rPr>
+                <w:b/>
+                <w:bCs/>
+              </w:rPr>
+              <w:t xml:space="preserve">Удержание</w:t>
+            </w:r>
+            <w:r>
+              <w:t xml:space="preserve"> (новое)</w:t>
+            </w:r>
+          </w:p>
+        </w:tc>
+      </w:tr>
+      <w:tr>
+        <w:tc>
+          <w:tcPr>
+            <w:tcW w:type="dxa" w:w="1606"/>
+          </w:tcPr>
+          <w:p>
+            <w:r>
+              <w:t xml:space="preserve">Пользователь, столкнувшийся с ошибкой</w:t>
+            </w:r>
+          </w:p>
+        </w:tc>
+        <w:tc>
+          <w:tcPr>
+            <w:tcW w:type="dxa" w:w="1606"/>
+          </w:tcPr>
+          <w:p>
+            <w:r>
+              <w:t xml:space="preserve">Понять и исправить ошибку без потери работы</w:t>
+            </w:r>
+          </w:p>
+        </w:tc>
+        <w:tc>
+          <w:tcPr>
+            <w:tcW w:type="dxa" w:w="1606"/>
+          </w:tcPr>
+          <w:p>
+            <w:r>
+              <w:t xml:space="preserve">Ошибка синтаксиса DSL → вкладка Problems показывает строку/причину → режим AI «Исправить ошибку» предлагает фикс</w:t>
+            </w:r>
+          </w:p>
+        </w:tc>
+        <w:tc>
+          <w:tcPr>
+            <w:tcW w:type="dxa" w:w="1606"/>
+          </w:tcPr>
+          <w:p>
+            <w:r>
+              <w:t xml:space="preserve">Не потерять доверие к инструменту в момент неудачи</w:t>
+            </w:r>
+          </w:p>
+        </w:tc>
+        <w:tc>
+          <w:tcPr>
+            <w:tcW w:type="dxa" w:w="1606"/>
+          </w:tcPr>
+          <w:p>
+            <w:r>
+              <w:t xml:space="preserve">Косвенно снижает отток (плохой опыт ошибки = причина ухода)</w:t>
+            </w:r>
+          </w:p>
+        </w:tc>
+        <w:tc>
+          <w:tcPr>
+            <w:tcW w:type="dxa" w:w="1606"/>
+          </w:tcPr>
+          <w:p>
+            <w:r>
+              <w:rPr>
+                <w:b/>
+                <w:bCs/>
+              </w:rPr>
+              <w:t xml:space="preserve">Поддержка/восстановление после ошибки</w:t>
+            </w:r>
+            <w:r>
+              <w:t xml:space="preserve"> (новое)</w:t>
+            </w:r>
+          </w:p>
+        </w:tc>
+      </w:tr>
+      <w:tr>
+        <w:tc>
+          <w:tcPr>
+            <w:tcW w:type="dxa" w:w="1606"/>
           </w:tcPr>
           <w:p>
             <w:r>
@@ -1185,7 +1535,7 @@
         </w:tc>
         <w:tc>
           <w:tcPr>
-            <w:tcW w:type="dxa" w:w="1927"/>
+            <w:tcW w:type="dxa" w:w="1606"/>
           </w:tcPr>
           <w:p>
             <w:r>
@@ -1195,7 +1545,7 @@
         </w:tc>
         <w:tc>
           <w:tcPr>
-            <w:tcW w:type="dxa" w:w="1927"/>
+            <w:tcW w:type="dxa" w:w="1606"/>
           </w:tcPr>
           <w:p>
             <w:r>
@@ -1205,7 +1555,7 @@
         </w:tc>
         <w:tc>
           <w:tcPr>
-            <w:tcW w:type="dxa" w:w="1927"/>
+            <w:tcW w:type="dxa" w:w="1606"/>
           </w:tcPr>
           <w:p>
             <w:r>
@@ -1215,11 +1565,769 @@
         </w:tc>
         <w:tc>
           <w:tcPr>
-            <w:tcW w:type="dxa" w:w="1927"/>
+            <w:tcW w:type="dxa" w:w="1606"/>
           </w:tcPr>
           <w:p>
             <w:r>
               <w:t xml:space="preserve">Расширяет число платящих мест на одну диаграмму</w:t>
+            </w:r>
+          </w:p>
+        </w:tc>
+        <w:tc>
+          <w:tcPr>
+            <w:tcW w:type="dxa" w:w="1606"/>
+          </w:tcPr>
+          <w:p>
+            <w:r>
+              <w:t xml:space="preserve">Ядро ценности (командное)</w:t>
+            </w:r>
+          </w:p>
+        </w:tc>
+      </w:tr>
+    </w:tbl>
+    <w:p>
+      <w:pPr>
+        <w:spacing w:after="120"/>
+      </w:pPr>
+    </w:p>
+    <w:p>
+      <w:pPr>
+        <w:pStyle w:val="Heading2"/>
+        <w:spacing w:after="100" w:before="200"/>
+      </w:pPr>
+      <w:r>
+        <w:t xml:space="preserve">3.2. Паспорт сценария — «Оплата после исчерпания бесплатной AI-квоты» (полный формат, методика §10.1)</w:t>
+      </w:r>
+    </w:p>
+    <w:tbl>
+      <w:tblPr>
+        <w:tblW w:type="dxa" w:w="9638"/>
+        <w:tblBorders>
+          <w:top w:val="single" w:color="auto" w:sz="4"/>
+          <w:left w:val="single" w:color="auto" w:sz="4"/>
+          <w:bottom w:val="single" w:color="auto" w:sz="4"/>
+          <w:right w:val="single" w:color="auto" w:sz="4"/>
+          <w:insideH w:val="single" w:color="auto" w:sz="4"/>
+          <w:insideV w:val="single" w:color="auto" w:sz="4"/>
+        </w:tblBorders>
+      </w:tblPr>
+      <w:tblGrid>
+        <w:gridCol w:w="4819"/>
+        <w:gridCol w:w="4819"/>
+      </w:tblGrid>
+      <w:tr>
+        <w:trPr>
+          <w:tblHeader/>
+        </w:trPr>
+        <w:tc>
+          <w:tcPr>
+            <w:tcW w:type="dxa" w:w="4819"/>
+            <w:shd w:fill="D9D9D9" w:val="clear"/>
+          </w:tcPr>
+          <w:p>
+            <w:r>
+              <w:rPr>
+                <w:b/>
+                <w:bCs/>
+              </w:rPr>
+              <w:t xml:space="preserve">Поле</w:t>
+            </w:r>
+          </w:p>
+        </w:tc>
+        <w:tc>
+          <w:tcPr>
+            <w:tcW w:type="dxa" w:w="4819"/>
+            <w:shd w:fill="D9D9D9" w:val="clear"/>
+          </w:tcPr>
+          <w:p>
+            <w:r>
+              <w:rPr>
+                <w:b/>
+                <w:bCs/>
+              </w:rPr>
+              <w:t xml:space="preserve">Значение</w:t>
+            </w:r>
+          </w:p>
+        </w:tc>
+      </w:tr>
+      <w:tr>
+        <w:tc>
+          <w:tcPr>
+            <w:tcW w:type="dxa" w:w="4819"/>
+          </w:tcPr>
+          <w:p>
+            <w:r>
+              <w:t xml:space="preserve">Название</w:t>
+            </w:r>
+          </w:p>
+        </w:tc>
+        <w:tc>
+          <w:tcPr>
+            <w:tcW w:type="dxa" w:w="4819"/>
+          </w:tcPr>
+          <w:p>
+            <w:r>
+              <w:t xml:space="preserve">Переход на платный тариф после исчерпания AI-квоты</w:t>
+            </w:r>
+          </w:p>
+        </w:tc>
+      </w:tr>
+      <w:tr>
+        <w:tc>
+          <w:tcPr>
+            <w:tcW w:type="dxa" w:w="4819"/>
+          </w:tcPr>
+          <w:p>
+            <w:r>
+              <w:t xml:space="preserve">Роль</w:t>
+            </w:r>
+          </w:p>
+        </w:tc>
+        <w:tc>
+          <w:tcPr>
+            <w:tcW w:type="dxa" w:w="4819"/>
+          </w:tcPr>
+          <w:p>
+            <w:r>
+              <w:t xml:space="preserve">Пользователь (Free-тариф)</w:t>
+            </w:r>
+          </w:p>
+        </w:tc>
+      </w:tr>
+      <w:tr>
+        <w:tc>
+          <w:tcPr>
+            <w:tcW w:type="dxa" w:w="4819"/>
+          </w:tcPr>
+          <w:p>
+            <w:r>
+              <w:t xml:space="preserve">Контекст</w:t>
+            </w:r>
+          </w:p>
+        </w:tc>
+        <w:tc>
+          <w:tcPr>
+            <w:tcW w:type="dxa" w:w="4819"/>
+          </w:tcPr>
+          <w:p>
+            <w:r>
+              <w:t xml:space="preserve">Пользователь активно работает с AI-режимами несколько дней подряд</w:t>
+            </w:r>
+          </w:p>
+        </w:tc>
+      </w:tr>
+      <w:tr>
+        <w:tc>
+          <w:tcPr>
+            <w:tcW w:type="dxa" w:w="4819"/>
+          </w:tcPr>
+          <w:p>
+            <w:r>
+              <w:t xml:space="preserve">Триггер</w:t>
+            </w:r>
+          </w:p>
+        </w:tc>
+        <w:tc>
+          <w:tcPr>
+            <w:tcW w:type="dxa" w:w="4819"/>
+          </w:tcPr>
+          <w:p>
+            <w:r>
+              <w:t xml:space="preserve">Достигнут дневной лимит (20 AI-запросов/день по умолчанию)</w:t>
+            </w:r>
+          </w:p>
+        </w:tc>
+      </w:tr>
+      <w:tr>
+        <w:tc>
+          <w:tcPr>
+            <w:tcW w:type="dxa" w:w="4819"/>
+          </w:tcPr>
+          <w:p>
+            <w:r>
+              <w:t xml:space="preserve">Цель</w:t>
+            </w:r>
+          </w:p>
+        </w:tc>
+        <w:tc>
+          <w:tcPr>
+            <w:tcW w:type="dxa" w:w="4819"/>
+          </w:tcPr>
+          <w:p>
+            <w:r>
+              <w:t xml:space="preserve">Продолжить использовать AI без ожидания сброса лимита следующим днём</w:t>
+            </w:r>
+          </w:p>
+        </w:tc>
+      </w:tr>
+      <w:tr>
+        <w:tc>
+          <w:tcPr>
+            <w:tcW w:type="dxa" w:w="4819"/>
+          </w:tcPr>
+          <w:p>
+            <w:r>
+              <w:t xml:space="preserve">Проблема/барьер</w:t>
+            </w:r>
+          </w:p>
+        </w:tc>
+        <w:tc>
+          <w:tcPr>
+            <w:tcW w:type="dxa" w:w="4819"/>
+          </w:tcPr>
+          <w:p>
+            <w:r>
+              <w:t xml:space="preserve">Раздражение от блокировки в середине рабочей задачи; риск ухода к бесплатному конкуренту (PlantUML/Mermaid)</w:t>
+            </w:r>
+          </w:p>
+        </w:tc>
+      </w:tr>
+      <w:tr>
+        <w:tc>
+          <w:tcPr>
+            <w:tcW w:type="dxa" w:w="4819"/>
+          </w:tcPr>
+          <w:p>
+            <w:r>
+              <w:t xml:space="preserve">Предусловия</w:t>
+            </w:r>
+          </w:p>
+        </w:tc>
+        <w:tc>
+          <w:tcPr>
+            <w:tcW w:type="dxa" w:w="4819"/>
+          </w:tcPr>
+          <w:p>
+            <w:r>
+              <w:t xml:space="preserve">Пользователь зарегистрирован, у него есть хотя бы одна сохранённая диаграмма</w:t>
+            </w:r>
+          </w:p>
+        </w:tc>
+      </w:tr>
+      <w:tr>
+        <w:tc>
+          <w:tcPr>
+            <w:tcW w:type="dxa" w:w="4819"/>
+          </w:tcPr>
+          <w:p>
+            <w:r>
+              <w:t xml:space="preserve">Основные шаги</w:t>
+            </w:r>
+          </w:p>
+        </w:tc>
+        <w:tc>
+          <w:tcPr>
+            <w:tcW w:type="dxa" w:w="4819"/>
+          </w:tcPr>
+          <w:p>
+            <w:r>
+              <w:t xml:space="preserve">1) Запрос к AI отклонён с объяснением причины → 2) Показан экран тарифов с прямым сравнением Free/платных лимитов → 3) Выбор тарифа → 4) Оплата → 5) Немедленное снятие ограничения</w:t>
+            </w:r>
+          </w:p>
+        </w:tc>
+      </w:tr>
+      <w:tr>
+        <w:tc>
+          <w:tcPr>
+            <w:tcW w:type="dxa" w:w="4819"/>
+          </w:tcPr>
+          <w:p>
+            <w:r>
+              <w:t xml:space="preserve">Данные</w:t>
+            </w:r>
+          </w:p>
+        </w:tc>
+        <w:tc>
+          <w:tcPr>
+            <w:tcW w:type="dxa" w:w="4819"/>
+          </w:tcPr>
+          <w:p>
+            <w:r>
+              <w:t xml:space="preserve">Текущее потребление квоты, история использования AI за период, выбранный тариф</w:t>
+            </w:r>
+          </w:p>
+        </w:tc>
+      </w:tr>
+      <w:tr>
+        <w:tc>
+          <w:tcPr>
+            <w:tcW w:type="dxa" w:w="4819"/>
+          </w:tcPr>
+          <w:p>
+            <w:r>
+              <w:t xml:space="preserve">Результат</w:t>
+            </w:r>
+          </w:p>
+        </w:tc>
+        <w:tc>
+          <w:tcPr>
+            <w:tcW w:type="dxa" w:w="4819"/>
+          </w:tcPr>
+          <w:p>
+            <w:r>
+              <w:t xml:space="preserve">Продолженная работа без потери контекста задачи</w:t>
+            </w:r>
+          </w:p>
+        </w:tc>
+      </w:tr>
+      <w:tr>
+        <w:tc>
+          <w:tcPr>
+            <w:tcW w:type="dxa" w:w="4819"/>
+          </w:tcPr>
+          <w:p>
+            <w:r>
+              <w:t xml:space="preserve">Точка монетизации</w:t>
+            </w:r>
+          </w:p>
+        </w:tc>
+        <w:tc>
+          <w:tcPr>
+            <w:tcW w:type="dxa" w:w="4819"/>
+          </w:tcPr>
+          <w:p>
+            <w:r>
+              <w:t xml:space="preserve">Именно здесь — единственный момент, где бесплатный пользователь превращается в платящего</w:t>
+            </w:r>
+          </w:p>
+        </w:tc>
+      </w:tr>
+      <w:tr>
+        <w:tc>
+          <w:tcPr>
+            <w:tcW w:type="dxa" w:w="4819"/>
+          </w:tcPr>
+          <w:p>
+            <w:r>
+              <w:t xml:space="preserve">Метрики</w:t>
+            </w:r>
+          </w:p>
+        </w:tc>
+        <w:tc>
+          <w:tcPr>
+            <w:tcW w:type="dxa" w:w="4819"/>
+          </w:tcPr>
+          <w:p>
+            <w:r>
+              <w:t xml:space="preserve">Доля пользователей, увидевших экран тарифов, которые оплачивают в течение 24 часов</w:t>
+            </w:r>
+          </w:p>
+        </w:tc>
+      </w:tr>
+      <w:tr>
+        <w:tc>
+          <w:tcPr>
+            <w:tcW w:type="dxa" w:w="4819"/>
+          </w:tcPr>
+          <w:p>
+            <w:r>
+              <w:t xml:space="preserve">Риски</w:t>
+            </w:r>
+          </w:p>
+        </w:tc>
+        <w:tc>
+          <w:tcPr>
+            <w:tcW w:type="dxa" w:w="4819"/>
+          </w:tcPr>
+          <w:p>
+            <w:r>
+              <w:t xml:space="preserve">Слишком агрессivnoe/непонятное сообщение об ограничении оттолкнёт, а не сконвертирует — формулировка ошибки требует отдельного UX-тестирования</w:t>
+            </w:r>
+          </w:p>
+        </w:tc>
+      </w:tr>
+      <w:tr>
+        <w:tc>
+          <w:tcPr>
+            <w:tcW w:type="dxa" w:w="4819"/>
+          </w:tcPr>
+          <w:p>
+            <w:r>
+              <w:t xml:space="preserve">Связь с Канвас</w:t>
+            </w:r>
+          </w:p>
+        </w:tc>
+        <w:tc>
+          <w:tcPr>
+            <w:tcW w:type="dxa" w:w="4819"/>
+          </w:tcPr>
+          <w:p>
+            <w:r>
+              <w:t xml:space="preserve">Напрямую реализует блок «Потоки доходов» (раздел 2)</w:t>
+            </w:r>
+          </w:p>
+        </w:tc>
+      </w:tr>
+    </w:tbl>
+    <w:p>
+      <w:pPr>
+        <w:spacing w:after="120"/>
+      </w:pPr>
+    </w:p>
+    <w:p>
+      <w:pPr>
+        <w:pStyle w:val="Heading2"/>
+        <w:spacing w:after="100" w:before="200"/>
+      </w:pPr>
+      <w:r>
+        <w:t xml:space="preserve">3.3. Паспорт сценария — «Восстановление после ошибки синтаксиса» (полный формат)</w:t>
+      </w:r>
+    </w:p>
+    <w:tbl>
+      <w:tblPr>
+        <w:tblW w:type="dxa" w:w="9638"/>
+        <w:tblBorders>
+          <w:top w:val="single" w:color="auto" w:sz="4"/>
+          <w:left w:val="single" w:color="auto" w:sz="4"/>
+          <w:bottom w:val="single" w:color="auto" w:sz="4"/>
+          <w:right w:val="single" w:color="auto" w:sz="4"/>
+          <w:insideH w:val="single" w:color="auto" w:sz="4"/>
+          <w:insideV w:val="single" w:color="auto" w:sz="4"/>
+        </w:tblBorders>
+      </w:tblPr>
+      <w:tblGrid>
+        <w:gridCol w:w="4819"/>
+        <w:gridCol w:w="4819"/>
+      </w:tblGrid>
+      <w:tr>
+        <w:trPr>
+          <w:tblHeader/>
+        </w:trPr>
+        <w:tc>
+          <w:tcPr>
+            <w:tcW w:type="dxa" w:w="4819"/>
+            <w:shd w:fill="D9D9D9" w:val="clear"/>
+          </w:tcPr>
+          <w:p>
+            <w:r>
+              <w:rPr>
+                <w:b/>
+                <w:bCs/>
+              </w:rPr>
+              <w:t xml:space="preserve">Поле</w:t>
+            </w:r>
+          </w:p>
+        </w:tc>
+        <w:tc>
+          <w:tcPr>
+            <w:tcW w:type="dxa" w:w="4819"/>
+            <w:shd w:fill="D9D9D9" w:val="clear"/>
+          </w:tcPr>
+          <w:p>
+            <w:r>
+              <w:rPr>
+                <w:b/>
+                <w:bCs/>
+              </w:rPr>
+              <w:t xml:space="preserve">Значение</w:t>
+            </w:r>
+          </w:p>
+        </w:tc>
+      </w:tr>
+      <w:tr>
+        <w:tc>
+          <w:tcPr>
+            <w:tcW w:type="dxa" w:w="4819"/>
+          </w:tcPr>
+          <w:p>
+            <w:r>
+              <w:t xml:space="preserve">Название</w:t>
+            </w:r>
+          </w:p>
+        </w:tc>
+        <w:tc>
+          <w:tcPr>
+            <w:tcW w:type="dxa" w:w="4819"/>
+          </w:tcPr>
+          <w:p>
+            <w:r>
+              <w:t xml:space="preserve">Диагностика и исправление ошибки DSL</w:t>
+            </w:r>
+          </w:p>
+        </w:tc>
+      </w:tr>
+      <w:tr>
+        <w:tc>
+          <w:tcPr>
+            <w:tcW w:type="dxa" w:w="4819"/>
+          </w:tcPr>
+          <w:p>
+            <w:r>
+              <w:t xml:space="preserve">Роль</w:t>
+            </w:r>
+          </w:p>
+        </w:tc>
+        <w:tc>
+          <w:tcPr>
+            <w:tcW w:type="dxa" w:w="4819"/>
+          </w:tcPr>
+          <w:p>
+            <w:r>
+              <w:t xml:space="preserve">Пользователь (любой тариф)</w:t>
+            </w:r>
+          </w:p>
+        </w:tc>
+      </w:tr>
+      <w:tr>
+        <w:tc>
+          <w:tcPr>
+            <w:tcW w:type="dxa" w:w="4819"/>
+          </w:tcPr>
+          <w:p>
+            <w:r>
+              <w:t xml:space="preserve">Контекст</w:t>
+            </w:r>
+          </w:p>
+        </w:tc>
+        <w:tc>
+          <w:tcPr>
+            <w:tcW w:type="dxa" w:w="4819"/>
+          </w:tcPr>
+          <w:p>
+            <w:r>
+              <w:t xml:space="preserve">Пользователь пишет или редактирует DSL-код вручную</w:t>
+            </w:r>
+          </w:p>
+        </w:tc>
+      </w:tr>
+      <w:tr>
+        <w:tc>
+          <w:tcPr>
+            <w:tcW w:type="dxa" w:w="4819"/>
+          </w:tcPr>
+          <w:p>
+            <w:r>
+              <w:t xml:space="preserve">Триггер</w:t>
+            </w:r>
+          </w:p>
+        </w:tc>
+        <w:tc>
+          <w:tcPr>
+            <w:tcW w:type="dxa" w:w="4819"/>
+          </w:tcPr>
+          <w:p>
+            <w:r>
+              <w:t xml:space="preserve">Парсер возвращает синтаксическую ошибку при нажатии Run</w:t>
+            </w:r>
+          </w:p>
+        </w:tc>
+      </w:tr>
+      <w:tr>
+        <w:tc>
+          <w:tcPr>
+            <w:tcW w:type="dxa" w:w="4819"/>
+          </w:tcPr>
+          <w:p>
+            <w:r>
+              <w:t xml:space="preserve">Цель</w:t>
+            </w:r>
+          </w:p>
+        </w:tc>
+        <w:tc>
+          <w:tcPr>
+            <w:tcW w:type="dxa" w:w="4819"/>
+          </w:tcPr>
+          <w:p>
+            <w:r>
+              <w:t xml:space="preserve">Получить корректный рендер, не разбираясь в грамматике DSL с нуля</w:t>
+            </w:r>
+          </w:p>
+        </w:tc>
+      </w:tr>
+      <w:tr>
+        <w:tc>
+          <w:tcPr>
+            <w:tcW w:type="dxa" w:w="4819"/>
+          </w:tcPr>
+          <w:p>
+            <w:r>
+              <w:t xml:space="preserve">Проблема/барьер</w:t>
+            </w:r>
+          </w:p>
+        </w:tc>
+        <w:tc>
+          <w:tcPr>
+            <w:tcW w:type="dxa" w:w="4819"/>
+          </w:tcPr>
+          <w:p>
+            <w:r>
+              <w:t xml:space="preserve">Сообщение об ошибке может быть непонятным новичку; риск бросить редактор в разочаровании</w:t>
+            </w:r>
+          </w:p>
+        </w:tc>
+      </w:tr>
+      <w:tr>
+        <w:tc>
+          <w:tcPr>
+            <w:tcW w:type="dxa" w:w="4819"/>
+          </w:tcPr>
+          <w:p>
+            <w:r>
+              <w:t xml:space="preserve">Предусловия</w:t>
+            </w:r>
+          </w:p>
+        </w:tc>
+        <w:tc>
+          <w:tcPr>
+            <w:tcW w:type="dxa" w:w="4819"/>
+          </w:tcPr>
+          <w:p>
+            <w:r>
+              <w:t xml:space="preserve">Есть текст DSL с ошибкой, доступна вкладка Problems</w:t>
+            </w:r>
+          </w:p>
+        </w:tc>
+      </w:tr>
+      <w:tr>
+        <w:tc>
+          <w:tcPr>
+            <w:tcW w:type="dxa" w:w="4819"/>
+          </w:tcPr>
+          <w:p>
+            <w:r>
+              <w:t xml:space="preserve">Основные шаги</w:t>
+            </w:r>
+          </w:p>
+        </w:tc>
+        <w:tc>
+          <w:tcPr>
+            <w:tcW w:type="dxa" w:w="4819"/>
+          </w:tcPr>
+          <w:p>
+            <w:r>
+              <w:t xml:space="preserve">1) Ошибка подсвечивается в редакторе с точной позицией (строка/столбец) → 2) Вкладка Problems показывает текст ошибки → 3) Пользователь нажимает AI-режим «Исправить ошибку» → 4) Система передаёт AI код + текст ошибки → 5) Предложенный фикс встраивается в редактор с атрибуцией</w:t>
+            </w:r>
+          </w:p>
+        </w:tc>
+      </w:tr>
+      <w:tr>
+        <w:tc>
+          <w:tcPr>
+            <w:tcW w:type="dxa" w:w="4819"/>
+          </w:tcPr>
+          <w:p>
+            <w:r>
+              <w:t xml:space="preserve">Данные</w:t>
+            </w:r>
+          </w:p>
+        </w:tc>
+        <w:tc>
+          <w:tcPr>
+            <w:tcW w:type="dxa" w:w="4819"/>
+          </w:tcPr>
+          <w:p>
+            <w:r>
+              <w:t xml:space="preserve">Текст ошибки, позиция, исходный DSL-код</w:t>
+            </w:r>
+          </w:p>
+        </w:tc>
+      </w:tr>
+      <w:tr>
+        <w:tc>
+          <w:tcPr>
+            <w:tcW w:type="dxa" w:w="4819"/>
+          </w:tcPr>
+          <w:p>
+            <w:r>
+              <w:t xml:space="preserve">Результат</w:t>
+            </w:r>
+          </w:p>
+        </w:tc>
+        <w:tc>
+          <w:tcPr>
+            <w:tcW w:type="dxa" w:w="4819"/>
+          </w:tcPr>
+          <w:p>
+            <w:r>
+              <w:t xml:space="preserve">Работающий рендер без ручного дебага грамматики</w:t>
+            </w:r>
+          </w:p>
+        </w:tc>
+      </w:tr>
+      <w:tr>
+        <w:tc>
+          <w:tcPr>
+            <w:tcW w:type="dxa" w:w="4819"/>
+          </w:tcPr>
+          <w:p>
+            <w:r>
+              <w:t xml:space="preserve">Точка монетизации</w:t>
+            </w:r>
+          </w:p>
+        </w:tc>
+        <w:tc>
+          <w:tcPr>
+            <w:tcW w:type="dxa" w:w="4819"/>
+          </w:tcPr>
+          <w:p>
+            <w:r>
+              <w:t xml:space="preserve">Косвенная — расходует AI-квоту при использовании режима «Исправить ошибку»</w:t>
+            </w:r>
+          </w:p>
+        </w:tc>
+      </w:tr>
+      <w:tr>
+        <w:tc>
+          <w:tcPr>
+            <w:tcW w:type="dxa" w:w="4819"/>
+          </w:tcPr>
+          <w:p>
+            <w:r>
+              <w:t xml:space="preserve">Метрики</w:t>
+            </w:r>
+          </w:p>
+        </w:tc>
+        <w:tc>
+          <w:tcPr>
+            <w:tcW w:type="dxa" w:w="4819"/>
+          </w:tcPr>
+          <w:p>
+            <w:r>
+              <w:t xml:space="preserve">Доля ошибок, исправленных через AI-режим, vs. вручную</w:t>
+            </w:r>
+          </w:p>
+        </w:tc>
+      </w:tr>
+      <w:tr>
+        <w:tc>
+          <w:tcPr>
+            <w:tcW w:type="dxa" w:w="4819"/>
+          </w:tcPr>
+          <w:p>
+            <w:r>
+              <w:t xml:space="preserve">Риски</w:t>
+            </w:r>
+          </w:p>
+        </w:tc>
+        <w:tc>
+          <w:tcPr>
+            <w:tcW w:type="dxa" w:w="4819"/>
+          </w:tcPr>
+          <w:p>
+            <w:r>
+              <w:t xml:space="preserve">Если AI многократно предлагает неверный фикс — подрывает доверие к самому AI-режиму, не только к парсеру</w:t>
+            </w:r>
+          </w:p>
+        </w:tc>
+      </w:tr>
+      <w:tr>
+        <w:tc>
+          <w:tcPr>
+            <w:tcW w:type="dxa" w:w="4819"/>
+          </w:tcPr>
+          <w:p>
+            <w:r>
+              <w:t xml:space="preserve">Связь с Канвас</w:t>
+            </w:r>
+          </w:p>
+        </w:tc>
+        <w:tc>
+          <w:tcPr>
+            <w:tcW w:type="dxa" w:w="4819"/>
+          </w:tcPr>
+          <w:p>
+            <w:r>
+              <w:t xml:space="preserve">Снижает барьер входа (ЛР4, «доверительный барьер») за счёт быстрого восстановления после неудачи</w:t>
             </w:r>
           </w:p>
         </w:tc>
@@ -1253,7 +2361,506 @@
         <w:t xml:space="preserve">design/mockups/*.dc.html</w:t>
       </w:r>
       <w:r>
-        <w:t xml:space="preserve">) — здесь сведён в формат методики курса.</w:t>
+        <w:t xml:space="preserve">). Ниже — не просто список экранов, а матрица «сценарий → экран» (методика §7, «Матрица_сценарий_интерфейс»): каждый экран обоснован конкретным шагом конкретного сценария из раздела 3, а не взят из макетов «в общем».</w:t>
+      </w:r>
+    </w:p>
+    <w:p>
+      <w:pPr>
+        <w:pStyle w:val="Heading2"/>
+        <w:spacing w:after="100" w:before="200"/>
+      </w:pPr>
+      <w:r>
+        <w:t xml:space="preserve">4.1. Матрица сценарий → интерфейсная единица</w:t>
+      </w:r>
+    </w:p>
+    <w:tbl>
+      <w:tblPr>
+        <w:tblW w:type="dxa" w:w="9638"/>
+        <w:tblBorders>
+          <w:top w:val="single" w:color="auto" w:sz="4"/>
+          <w:left w:val="single" w:color="auto" w:sz="4"/>
+          <w:bottom w:val="single" w:color="auto" w:sz="4"/>
+          <w:right w:val="single" w:color="auto" w:sz="4"/>
+          <w:insideH w:val="single" w:color="auto" w:sz="4"/>
+          <w:insideV w:val="single" w:color="auto" w:sz="4"/>
+        </w:tblBorders>
+      </w:tblPr>
+      <w:tblGrid>
+        <w:gridCol w:w="2409"/>
+        <w:gridCol w:w="2409"/>
+        <w:gridCol w:w="2409"/>
+        <w:gridCol w:w="2409"/>
+      </w:tblGrid>
+      <w:tr>
+        <w:trPr>
+          <w:tblHeader/>
+        </w:trPr>
+        <w:tc>
+          <w:tcPr>
+            <w:tcW w:type="dxa" w:w="2409"/>
+            <w:shd w:fill="D9D9D9" w:val="clear"/>
+          </w:tcPr>
+          <w:p>
+            <w:r>
+              <w:rPr>
+                <w:b/>
+                <w:bCs/>
+              </w:rPr>
+              <w:t xml:space="preserve">Источник (сценарий, шаг)</w:t>
+            </w:r>
+          </w:p>
+        </w:tc>
+        <w:tc>
+          <w:tcPr>
+            <w:tcW w:type="dxa" w:w="2409"/>
+            <w:shd w:fill="D9D9D9" w:val="clear"/>
+          </w:tcPr>
+          <w:p>
+            <w:r>
+              <w:rPr>
+                <w:b/>
+                <w:bCs/>
+              </w:rPr>
+              <w:t xml:space="preserve">Задача экрана</w:t>
+            </w:r>
+          </w:p>
+        </w:tc>
+        <w:tc>
+          <w:tcPr>
+            <w:tcW w:type="dxa" w:w="2409"/>
+            <w:shd w:fill="D9D9D9" w:val="clear"/>
+          </w:tcPr>
+          <w:p>
+            <w:r>
+              <w:rPr>
+                <w:b/>
+                <w:bCs/>
+              </w:rPr>
+              <w:t xml:space="preserve">Экран/интерфейсная единица</w:t>
+            </w:r>
+          </w:p>
+        </w:tc>
+        <w:tc>
+          <w:tcPr>
+            <w:tcW w:type="dxa" w:w="2409"/>
+            <w:shd w:fill="D9D9D9" w:val="clear"/>
+          </w:tcPr>
+          <w:p>
+            <w:r>
+              <w:rPr>
+                <w:b/>
+                <w:bCs/>
+              </w:rPr>
+              <w:t xml:space="preserve">Приоритет</w:t>
+            </w:r>
+          </w:p>
+        </w:tc>
+      </w:tr>
+      <w:tr>
+        <w:tc>
+          <w:tcPr>
+            <w:tcW w:type="dxa" w:w="2409"/>
+          </w:tcPr>
+          <w:p>
+            <w:r>
+              <w:t xml:space="preserve">Discovery, шаг «открыть лендинг/документацию»</w:t>
+            </w:r>
+          </w:p>
+        </w:tc>
+        <w:tc>
+          <w:tcPr>
+            <w:tcW w:type="dxa" w:w="2409"/>
+          </w:tcPr>
+          <w:p>
+            <w:r>
+              <w:t xml:space="preserve">Объяснить продукт до регистрации</w:t>
+            </w:r>
+          </w:p>
+        </w:tc>
+        <w:tc>
+          <w:tcPr>
+            <w:tcW w:type="dxa" w:w="2409"/>
+          </w:tcPr>
+          <w:p>
+            <w:r>
+              <w:t xml:space="preserve">Лендинг + встроенная документация (cheat sheet DSL)</w:t>
+            </w:r>
+          </w:p>
+        </w:tc>
+        <w:tc>
+          <w:tcPr>
+            <w:tcW w:type="dxa" w:w="2409"/>
+          </w:tcPr>
+          <w:p>
+            <w:r>
+              <w:t xml:space="preserve">Высокий</w:t>
+            </w:r>
+          </w:p>
+        </w:tc>
+      </w:tr>
+      <w:tr>
+        <w:tc>
+          <w:tcPr>
+            <w:tcW w:type="dxa" w:w="2409"/>
+          </w:tcPr>
+          <w:p>
+            <w:r>
+              <w:t xml:space="preserve">Регистрация/вход (общий для всех сценариев)</w:t>
+            </w:r>
+          </w:p>
+        </w:tc>
+        <w:tc>
+          <w:tcPr>
+            <w:tcW w:type="dxa" w:w="2409"/>
+          </w:tcPr>
+          <w:p>
+            <w:r>
+              <w:t xml:space="preserve">Аутентификация</w:t>
+            </w:r>
+          </w:p>
+        </w:tc>
+        <w:tc>
+          <w:tcPr>
+            <w:tcW w:type="dxa" w:w="2409"/>
+          </w:tcPr>
+          <w:p>
+            <w:r>
+              <w:t xml:space="preserve">Экран логина/регистрации (email+пароль)</w:t>
+            </w:r>
+          </w:p>
+        </w:tc>
+        <w:tc>
+          <w:tcPr>
+            <w:tcW w:type="dxa" w:w="2409"/>
+          </w:tcPr>
+          <w:p>
+            <w:r>
+              <w:t xml:space="preserve">Высокий</w:t>
+            </w:r>
+          </w:p>
+        </w:tc>
+      </w:tr>
+      <w:tr>
+        <w:tc>
+          <w:tcPr>
+            <w:tcW w:type="dxa" w:w="2409"/>
+          </w:tcPr>
+          <w:p>
+            <w:r>
+              <w:t xml:space="preserve">Ядро ценности, шаг «написание DSL → Run»</w:t>
+            </w:r>
+          </w:p>
+        </w:tc>
+        <w:tc>
+          <w:tcPr>
+            <w:tcW w:type="dxa" w:w="2409"/>
+          </w:tcPr>
+          <w:p>
+            <w:r>
+              <w:t xml:space="preserve">Основная рабочая область</w:t>
+            </w:r>
+          </w:p>
+        </w:tc>
+        <w:tc>
+          <w:tcPr>
+            <w:tcW w:type="dxa" w:w="2409"/>
+          </w:tcPr>
+          <w:p>
+            <w:r>
+              <w:t xml:space="preserve">IDE-оболочка (редактор Monaco + канвас в сплите)</w:t>
+            </w:r>
+          </w:p>
+        </w:tc>
+        <w:tc>
+          <w:tcPr>
+            <w:tcW w:type="dxa" w:w="2409"/>
+          </w:tcPr>
+          <w:p>
+            <w:r>
+              <w:t xml:space="preserve">Высокий</w:t>
+            </w:r>
+          </w:p>
+        </w:tc>
+      </w:tr>
+      <w:tr>
+        <w:tc>
+          <w:tcPr>
+            <w:tcW w:type="dxa" w:w="2409"/>
+          </w:tcPr>
+          <w:p>
+            <w:r>
+              <w:t xml:space="preserve">Ядро ценности (AI-заказчик), шаг «открыть модалку AI»</w:t>
+            </w:r>
+          </w:p>
+        </w:tc>
+        <w:tc>
+          <w:tcPr>
+            <w:tcW w:type="dxa" w:w="2409"/>
+          </w:tcPr>
+          <w:p>
+            <w:r>
+              <w:t xml:space="preserve">Генерация/исправление DSL-кода</w:t>
+            </w:r>
+          </w:p>
+        </w:tc>
+        <w:tc>
+          <w:tcPr>
+            <w:tcW w:type="dxa" w:w="2409"/>
+          </w:tcPr>
+          <w:p>
+            <w:r>
+              <w:t xml:space="preserve">Модалка AI-ассистента (4 вкладки режимов)</w:t>
+            </w:r>
+          </w:p>
+        </w:tc>
+        <w:tc>
+          <w:tcPr>
+            <w:tcW w:type="dxa" w:w="2409"/>
+          </w:tcPr>
+          <w:p>
+            <w:r>
+              <w:t xml:space="preserve">Высокий</w:t>
+            </w:r>
+          </w:p>
+        </w:tc>
+      </w:tr>
+      <w:tr>
+        <w:tc>
+          <w:tcPr>
+            <w:tcW w:type="dxa" w:w="2409"/>
+          </w:tcPr>
+          <w:p>
+            <w:r>
+              <w:t xml:space="preserve">Восстановление после ошибки, шаг «ошибка подсвечивается»</w:t>
+            </w:r>
+          </w:p>
+        </w:tc>
+        <w:tc>
+          <w:tcPr>
+            <w:tcW w:type="dxa" w:w="2409"/>
+          </w:tcPr>
+          <w:p>
+            <w:r>
+              <w:t xml:space="preserve">Показать, где и почему ошибка</w:t>
+            </w:r>
+          </w:p>
+        </w:tc>
+        <w:tc>
+          <w:tcPr>
+            <w:tcW w:type="dxa" w:w="2409"/>
+          </w:tcPr>
+          <w:p>
+            <w:r>
+              <w:t xml:space="preserve">Подсветка в редакторе + вкладка Problems нижней панели</w:t>
+            </w:r>
+          </w:p>
+        </w:tc>
+        <w:tc>
+          <w:tcPr>
+            <w:tcW w:type="dxa" w:w="2409"/>
+          </w:tcPr>
+          <w:p>
+            <w:r>
+              <w:t xml:space="preserve">Высокий</w:t>
+            </w:r>
+          </w:p>
+        </w:tc>
+      </w:tr>
+      <w:tr>
+        <w:tc>
+          <w:tcPr>
+            <w:tcW w:type="dxa" w:w="2409"/>
+          </w:tcPr>
+          <w:p>
+            <w:r>
+              <w:t xml:space="preserve">Ядро ценности, шаг «сохранение версии → экспорт»</w:t>
+            </w:r>
+          </w:p>
+        </w:tc>
+        <w:tc>
+          <w:tcPr>
+            <w:tcW w:type="dxa" w:w="2409"/>
+          </w:tcPr>
+          <w:p>
+            <w:r>
+              <w:t xml:space="preserve">Экспорт результата</w:t>
+            </w:r>
+          </w:p>
+        </w:tc>
+        <w:tc>
+          <w:tcPr>
+            <w:tcW w:type="dxa" w:w="2409"/>
+          </w:tcPr>
+          <w:p>
+            <w:r>
+              <w:t xml:space="preserve">Дропдаун Save (устройство — первый релиз; GitHub/Google Drive — следующий, требует OAuth)</w:t>
+            </w:r>
+          </w:p>
+        </w:tc>
+        <w:tc>
+          <w:tcPr>
+            <w:tcW w:type="dxa" w:w="2409"/>
+          </w:tcPr>
+          <w:p>
+            <w:r>
+              <w:t xml:space="preserve">Первый релиз — частично</w:t>
+            </w:r>
+          </w:p>
+        </w:tc>
+      </w:tr>
+      <w:tr>
+        <w:tc>
+          <w:tcPr>
+            <w:tcW w:type="dxa" w:w="2409"/>
+          </w:tcPr>
+          <w:p>
+            <w:r>
+              <w:t xml:space="preserve">Удержание, шаг «увидеть историю версий»</w:t>
+            </w:r>
+          </w:p>
+        </w:tc>
+        <w:tc>
+          <w:tcPr>
+            <w:tcW w:type="dxa" w:w="2409"/>
+          </w:tcPr>
+          <w:p>
+            <w:r>
+              <w:t xml:space="preserve">Просмотр/откат версий</w:t>
+            </w:r>
+          </w:p>
+        </w:tc>
+        <w:tc>
+          <w:tcPr>
+            <w:tcW w:type="dxa" w:w="2409"/>
+          </w:tcPr>
+          <w:p>
+            <w:r>
+              <w:t xml:space="preserve">Модалка истории версий с diff</w:t>
+            </w:r>
+          </w:p>
+        </w:tc>
+        <w:tc>
+          <w:tcPr>
+            <w:tcW w:type="dxa" w:w="2409"/>
+          </w:tcPr>
+          <w:p>
+            <w:r>
+              <w:t xml:space="preserve">Следующий релиз</w:t>
+            </w:r>
+          </w:p>
+        </w:tc>
+      </w:tr>
+      <w:tr>
+        <w:tc>
+          <w:tcPr>
+            <w:tcW w:type="dxa" w:w="2409"/>
+          </w:tcPr>
+          <w:p>
+            <w:r>
+              <w:rPr>
+                <w:b/>
+                <w:bCs/>
+              </w:rPr>
+              <w:t xml:space="preserve">Монетизация</w:t>
+            </w:r>
+            <w:r>
+              <w:t xml:space="preserve">, шаг «показан экран тарифов»</w:t>
+            </w:r>
+          </w:p>
+        </w:tc>
+        <w:tc>
+          <w:tcPr>
+            <w:tcW w:type="dxa" w:w="2409"/>
+          </w:tcPr>
+          <w:p>
+            <w:r>
+              <w:t xml:space="preserve">Конвертировать Free → платный тариф</w:t>
+            </w:r>
+          </w:p>
+        </w:tc>
+        <w:tc>
+          <w:tcPr>
+            <w:tcW w:type="dxa" w:w="2409"/>
+          </w:tcPr>
+          <w:p>
+            <w:r>
+              <w:rPr>
+                <w:b/>
+                <w:bCs/>
+              </w:rPr>
+              <w:t xml:space="preserve">Экран/модалка тарифов и оплаты</w:t>
+            </w:r>
+            <w:r>
+              <w:t xml:space="preserve"> (отсутствовал в предыдущей версии — добавлен именно как прямое следствие паспорта сценария из раздела 3.2)</w:t>
+            </w:r>
+          </w:p>
+        </w:tc>
+        <w:tc>
+          <w:tcPr>
+            <w:tcW w:type="dxa" w:w="2409"/>
+          </w:tcPr>
+          <w:p>
+            <w:r>
+              <w:t xml:space="preserve">Первый релиз (без него точка монетизации из Канваса нереализуема)</w:t>
+            </w:r>
+          </w:p>
+        </w:tc>
+      </w:tr>
+      <w:tr>
+        <w:tc>
+          <w:tcPr>
+            <w:tcW w:type="dxa" w:w="2409"/>
+          </w:tcPr>
+          <w:p>
+            <w:r>
+              <w:t xml:space="preserve">Ядро ценности, шаг «вставить шаблон нотации»</w:t>
+            </w:r>
+          </w:p>
+        </w:tc>
+        <w:tc>
+          <w:tcPr>
+            <w:tcW w:type="dxa" w:w="2409"/>
+          </w:tcPr>
+          <w:p>
+            <w:r>
+              <w:t xml:space="preserve">Быстрый старт без чистого листа</w:t>
+            </w:r>
+          </w:p>
+        </w:tc>
+        <w:tc>
+          <w:tcPr>
+            <w:tcW w:type="dxa" w:w="2409"/>
+          </w:tcPr>
+          <w:p>
+            <w:r>
+              <w:t xml:space="preserve">Панель шаблонов нотаций в сайдбаре</w:t>
+            </w:r>
+          </w:p>
+        </w:tc>
+        <w:tc>
+          <w:tcPr>
+            <w:tcW w:type="dxa" w:w="2409"/>
+          </w:tcPr>
+          <w:p>
+            <w:r>
+              <w:t xml:space="preserve">Первый релиз</w:t>
+            </w:r>
+          </w:p>
+        </w:tc>
+      </w:tr>
+    </w:tbl>
+    <w:p>
+      <w:pPr>
+        <w:spacing w:after="120"/>
+      </w:pPr>
+    </w:p>
+    <w:p>
+      <w:pPr>
+        <w:pStyle w:val="Heading2"/>
+        <w:spacing w:after="100" w:before="200"/>
+      </w:pPr>
+      <w:r>
+        <w:t xml:space="preserve">4.2. Состояния интерфейса (методика §12, 8 типов — ранее не описывались вообще)</w:t>
       </w:r>
     </w:p>
     <w:tbl>
@@ -1288,7 +2895,7 @@
                 <w:b/>
                 <w:bCs/>
               </w:rPr>
-              <w:t xml:space="preserve">Интерфейсная единица</w:t>
+              <w:t xml:space="preserve">Состояние</w:t>
             </w:r>
           </w:p>
         </w:tc>
@@ -1303,7 +2910,7 @@
                 <w:b/>
                 <w:bCs/>
               </w:rPr>
-              <w:t xml:space="preserve">Задача</w:t>
+              <w:t xml:space="preserve">Где проявляется</w:t>
             </w:r>
           </w:p>
         </w:tc>
@@ -1318,7 +2925,7 @@
                 <w:b/>
                 <w:bCs/>
               </w:rPr>
-              <w:t xml:space="preserve">Релиз</w:t>
+              <w:t xml:space="preserve">Что показывать</w:t>
             </w:r>
           </w:p>
         </w:tc>
@@ -1330,7 +2937,7 @@
           </w:tcPr>
           <w:p>
             <w:r>
-              <w:t xml:space="preserve">Экран логина/регистрации</w:t>
+              <w:t xml:space="preserve">Начальное</w:t>
             </w:r>
           </w:p>
         </w:tc>
@@ -1340,7 +2947,7 @@
           </w:tcPr>
           <w:p>
             <w:r>
-              <w:t xml:space="preserve">Вход по email+паролю, ссылка на регистрацию</w:t>
+              <w:t xml:space="preserve">IDE при первом открытии новой диаграммы</w:t>
             </w:r>
           </w:p>
         </w:tc>
@@ -1350,7 +2957,7 @@
           </w:tcPr>
           <w:p>
             <w:r>
-              <w:t xml:space="preserve">Первый</w:t>
+              <w:t xml:space="preserve">Пустой редактор с подсказкой «Начните с шаблона или напишите DSL-код»</w:t>
             </w:r>
           </w:p>
         </w:tc>
@@ -1362,7 +2969,7 @@
           </w:tcPr>
           <w:p>
             <w:r>
-              <w:t xml:space="preserve">IDE-оболочка (титлбар + activity bar + сайдбар + редактор Monaco + канвас в сплите + нижняя панель + статус-бар)</w:t>
+              <w:t xml:space="preserve">Пустое</w:t>
             </w:r>
           </w:p>
         </w:tc>
@@ -1372,7 +2979,7 @@
           </w:tcPr>
           <w:p>
             <w:r>
-              <w:t xml:space="preserve">Основной рабочий экран: написание DSL, просмотр рендера</w:t>
+              <w:t xml:space="preserve">Список диаграмм пользователя без единой сохранённой версии</w:t>
             </w:r>
           </w:p>
         </w:tc>
@@ -1382,7 +2989,7 @@
           </w:tcPr>
           <w:p>
             <w:r>
-              <w:t xml:space="preserve">Первый</w:t>
+              <w:t xml:space="preserve">«У вас пока нет сохранённых диаграмм» + кнопка «Создать»</w:t>
             </w:r>
           </w:p>
         </w:tc>
@@ -1394,7 +3001,7 @@
           </w:tcPr>
           <w:p>
             <w:r>
-              <w:t xml:space="preserve">Модалка AI-ассистента (4 вкладки режимов)</w:t>
+              <w:t xml:space="preserve">Загрузка</w:t>
             </w:r>
           </w:p>
         </w:tc>
@@ -1404,7 +3011,7 @@
           </w:tcPr>
           <w:p>
             <w:r>
-              <w:t xml:space="preserve">Генерация/исправление DSL-кода</w:t>
+              <w:t xml:space="preserve">Рендер диаграммы, генерация AI-кода</w:t>
             </w:r>
           </w:p>
         </w:tc>
@@ -1414,7 +3021,7 @@
           </w:tcPr>
           <w:p>
             <w:r>
-              <w:t xml:space="preserve">Первый</w:t>
+              <w:t xml:space="preserve">Индикатор прогресса на канвасе / в модалке AI (AI-генерация может занимать секунды)</w:t>
             </w:r>
           </w:p>
         </w:tc>
@@ -1426,7 +3033,7 @@
           </w:tcPr>
           <w:p>
             <w:r>
-              <w:t xml:space="preserve">Панель шаблонов нотаций в сайдбаре</w:t>
+              <w:t xml:space="preserve">Ошибка</w:t>
             </w:r>
           </w:p>
         </w:tc>
@@ -1436,7 +3043,7 @@
           </w:tcPr>
           <w:p>
             <w:r>
-              <w:t xml:space="preserve">Вставка готового шаблона по нотации</w:t>
+              <w:t xml:space="preserve">Синтаксическая ошибка DSL, сбой AI-запроса, исчерпание квоты</w:t>
             </w:r>
           </w:p>
         </w:tc>
@@ -1446,7 +3053,7 @@
           </w:tcPr>
           <w:p>
             <w:r>
-              <w:t xml:space="preserve">Первый</w:t>
+              <w:t xml:space="preserve">Точная позиция ошибки (строка/столбец) в редакторе; отдельное сообщение для AI-ошибок vs. синтаксических</w:t>
             </w:r>
           </w:p>
         </w:tc>
@@ -1458,7 +3065,7 @@
           </w:tcPr>
           <w:p>
             <w:r>
-              <w:t xml:space="preserve">Вкладка Problems нижней панели</w:t>
+              <w:t xml:space="preserve">Успех</w:t>
             </w:r>
           </w:p>
         </w:tc>
@@ -1468,7 +3075,7 @@
           </w:tcPr>
           <w:p>
             <w:r>
-              <w:t xml:space="preserve">Список ошибок/предупреждений валидации</w:t>
+              <w:t xml:space="preserve">Диаграмма успешно отрендерена, версия сохранена</w:t>
             </w:r>
           </w:p>
         </w:tc>
@@ -1478,7 +3085,16 @@
           </w:tcPr>
           <w:p>
             <w:r>
-              <w:t xml:space="preserve">Первый</w:t>
+              <w:t xml:space="preserve">Тост-уведомление «OK» (уже спроектировано, </w:t>
+            </w:r>
+            <w:r>
+              <w:rPr>
+                <w:rFonts w:ascii="Consolas" w:cs="Consolas" w:eastAsia="Consolas" w:hAnsi="Consolas"/>
+              </w:rPr>
+              <w:t xml:space="preserve">.toast</w:t>
+            </w:r>
+            <w:r>
+              <w:t xml:space="preserve"> в макетах)</w:t>
             </w:r>
           </w:p>
         </w:tc>
@@ -1490,7 +3106,7 @@
           </w:tcPr>
           <w:p>
             <w:r>
-              <w:t xml:space="preserve">Дропдаун Save (устройство / GitHub / Google Drive)</w:t>
+              <w:t xml:space="preserve">Ограниченный доступ</w:t>
             </w:r>
           </w:p>
         </w:tc>
@@ -1500,7 +3116,7 @@
           </w:tcPr>
           <w:p>
             <w:r>
-              <w:t xml:space="preserve">Экспорт диаграммы</w:t>
+              <w:t xml:space="preserve">AI-квота исчерпана (см. паспорт сценария 3.2)</w:t>
             </w:r>
           </w:p>
         </w:tc>
@@ -1510,7 +3126,7 @@
           </w:tcPr>
           <w:p>
             <w:r>
-              <w:t xml:space="preserve">Первый (устройство) / Следующий (GitHub/Google Drive — OAuth)</w:t>
+              <w:t xml:space="preserve">Блокировка AI-кнопки + прямая ссылка на экран тарифов</w:t>
             </w:r>
           </w:p>
         </w:tc>
@@ -1522,7 +3138,7 @@
           </w:tcPr>
           <w:p>
             <w:r>
-              <w:t xml:space="preserve">Модалка истории версий с diff</w:t>
+              <w:t xml:space="preserve">Предупреждение</w:t>
             </w:r>
           </w:p>
         </w:tc>
@@ -1532,7 +3148,7 @@
           </w:tcPr>
           <w:p>
             <w:r>
-              <w:t xml:space="preserve">Просмотр/откат версий</w:t>
+              <w:t xml:space="preserve">Валидация нашла warning, не блокирующий рендер (напр. ERD без первичного ключа)</w:t>
             </w:r>
           </w:p>
         </w:tc>
@@ -1542,7 +3158,7 @@
           </w:tcPr>
           <w:p>
             <w:r>
-              <w:t xml:space="preserve">Следующий</w:t>
+              <w:t xml:space="preserve">Волнистое подчёркивание жёлтым в редакторе, вкладка Problems</w:t>
             </w:r>
           </w:p>
         </w:tc>
@@ -1554,7 +3170,7 @@
           </w:tcPr>
           <w:p>
             <w:r>
-              <w:t xml:space="preserve">Модалка встроенной документации</w:t>
+              <w:t xml:space="preserve">Повторное использование</w:t>
             </w:r>
           </w:p>
         </w:tc>
@@ -1564,7 +3180,7 @@
           </w:tcPr>
           <w:p>
             <w:r>
-              <w:t xml:space="preserve">Cheat sheet синтаксиса DSL</w:t>
+              <w:t xml:space="preserve">Возврат к ранее сохранённой диаграмме</w:t>
             </w:r>
           </w:p>
         </w:tc>
@@ -1574,7 +3190,7 @@
           </w:tcPr>
           <w:p>
             <w:r>
-              <w:t xml:space="preserve">Первый</w:t>
+              <w:t xml:space="preserve">Восстановление состояния канваса и позиции курсора из последней сессии</w:t>
             </w:r>
           </w:p>
         </w:tc>
@@ -1695,7 +3311,17 @@
               <w:t xml:space="preserve">erd.crows_foot.logical</w:t>
             </w:r>
             <w:r>
-              <w:t xml:space="preserve"> с валидацией + аутентификация</w:t>
+              <w:t xml:space="preserve"> с валидацией + аутентификация + </w:t>
+            </w:r>
+            <w:r>
+              <w:rPr>
+                <w:b/>
+                <w:bCs/>
+              </w:rPr>
+              <w:t xml:space="preserve">экран тарифов/оплаты</w:t>
+            </w:r>
+            <w:r>
+              <w:t xml:space="preserve"> (добавлен по итогам раздела 4 — без него точка монетизации нереализуема)</w:t>
             </w:r>
           </w:p>
         </w:tc>
@@ -1802,6 +3428,388 @@
           <w:p>
             <w:r>
               <w:t xml:space="preserve">Выход в смежные ниши (бизнес-процессы, формальный анализ) — отдельная волна монетизации для enterprise-сегмента</w:t>
+            </w:r>
+          </w:p>
+        </w:tc>
+      </w:tr>
+    </w:tbl>
+    <w:p>
+      <w:pPr>
+        <w:spacing w:after="120"/>
+      </w:pPr>
+    </w:p>
+    <w:p>
+      <w:pPr>
+        <w:pStyle w:val="Heading2"/>
+        <w:spacing w:after="100" w:before="200"/>
+      </w:pPr>
+      <w:r>
+        <w:t xml:space="preserve">5.1. Обоснование очерёдности (качественный скоринг, методика §8 — связь с ценностью/монетизацией/сложность/риск)</w:t>
+      </w:r>
+    </w:p>
+    <w:tbl>
+      <w:tblPr>
+        <w:tblW w:type="dxa" w:w="9638"/>
+        <w:tblBorders>
+          <w:top w:val="single" w:color="auto" w:sz="4"/>
+          <w:left w:val="single" w:color="auto" w:sz="4"/>
+          <w:bottom w:val="single" w:color="auto" w:sz="4"/>
+          <w:right w:val="single" w:color="auto" w:sz="4"/>
+          <w:insideH w:val="single" w:color="auto" w:sz="4"/>
+          <w:insideV w:val="single" w:color="auto" w:sz="4"/>
+        </w:tblBorders>
+      </w:tblPr>
+      <w:tblGrid>
+        <w:gridCol w:w="1606"/>
+        <w:gridCol w:w="1606"/>
+        <w:gridCol w:w="1606"/>
+        <w:gridCol w:w="1606"/>
+        <w:gridCol w:w="1606"/>
+        <w:gridCol w:w="1606"/>
+      </w:tblGrid>
+      <w:tr>
+        <w:trPr>
+          <w:tblHeader/>
+        </w:trPr>
+        <w:tc>
+          <w:tcPr>
+            <w:tcW w:type="dxa" w:w="1606"/>
+            <w:shd w:fill="D9D9D9" w:val="clear"/>
+          </w:tcPr>
+          <w:p>
+            <w:r>
+              <w:rPr>
+                <w:b/>
+                <w:bCs/>
+              </w:rPr>
+              <w:t xml:space="preserve">Элемент</w:t>
+            </w:r>
+          </w:p>
+        </w:tc>
+        <w:tc>
+          <w:tcPr>
+            <w:tcW w:type="dxa" w:w="1606"/>
+            <w:shd w:fill="D9D9D9" w:val="clear"/>
+          </w:tcPr>
+          <w:p>
+            <w:r>
+              <w:rPr>
+                <w:b/>
+                <w:bCs/>
+              </w:rPr>
+              <w:t xml:space="preserve">Связь с ценностью</w:t>
+            </w:r>
+          </w:p>
+        </w:tc>
+        <w:tc>
+          <w:tcPr>
+            <w:tcW w:type="dxa" w:w="1606"/>
+            <w:shd w:fill="D9D9D9" w:val="clear"/>
+          </w:tcPr>
+          <w:p>
+            <w:r>
+              <w:rPr>
+                <w:b/>
+                <w:bCs/>
+              </w:rPr>
+              <w:t xml:space="preserve">Связь с монетизацией</w:t>
+            </w:r>
+          </w:p>
+        </w:tc>
+        <w:tc>
+          <w:tcPr>
+            <w:tcW w:type="dxa" w:w="1606"/>
+            <w:shd w:fill="D9D9D9" w:val="clear"/>
+          </w:tcPr>
+          <w:p>
+            <w:r>
+              <w:rPr>
+                <w:b/>
+                <w:bCs/>
+              </w:rPr>
+              <w:t xml:space="preserve">Трудоёмкость</w:t>
+            </w:r>
+          </w:p>
+        </w:tc>
+        <w:tc>
+          <w:tcPr>
+            <w:tcW w:type="dxa" w:w="1606"/>
+            <w:shd w:fill="D9D9D9" w:val="clear"/>
+          </w:tcPr>
+          <w:p>
+            <w:r>
+              <w:rPr>
+                <w:b/>
+                <w:bCs/>
+              </w:rPr>
+              <w:t xml:space="preserve">Риск отложить</w:t>
+            </w:r>
+          </w:p>
+        </w:tc>
+        <w:tc>
+          <w:tcPr>
+            <w:tcW w:type="dxa" w:w="1606"/>
+            <w:shd w:fill="D9D9D9" w:val="clear"/>
+          </w:tcPr>
+          <w:p>
+            <w:r>
+              <w:rPr>
+                <w:b/>
+                <w:bCs/>
+              </w:rPr>
+              <w:t xml:space="preserve">Релиз</w:t>
+            </w:r>
+          </w:p>
+        </w:tc>
+      </w:tr>
+      <w:tr>
+        <w:tc>
+          <w:tcPr>
+            <w:tcW w:type="dxa" w:w="1606"/>
+          </w:tcPr>
+          <w:p>
+            <w:r>
+              <w:t xml:space="preserve">DSL-редактор + рендер + версии</w:t>
+            </w:r>
+          </w:p>
+        </w:tc>
+        <w:tc>
+          <w:tcPr>
+            <w:tcW w:type="dxa" w:w="1606"/>
+          </w:tcPr>
+          <w:p>
+            <w:r>
+              <w:t xml:space="preserve">Высокая — без этого нет продукта вообще</w:t>
+            </w:r>
+          </w:p>
+        </w:tc>
+        <w:tc>
+          <w:tcPr>
+            <w:tcW w:type="dxa" w:w="1606"/>
+          </w:tcPr>
+          <w:p>
+            <w:r>
+              <w:t xml:space="preserve">Косвенная</w:t>
+            </w:r>
+          </w:p>
+        </w:tc>
+        <w:tc>
+          <w:tcPr>
+            <w:tcW w:type="dxa" w:w="1606"/>
+          </w:tcPr>
+          <w:p>
+            <w:r>
+              <w:t xml:space="preserve">Низкая (уже реализовано)</w:t>
+            </w:r>
+          </w:p>
+        </w:tc>
+        <w:tc>
+          <w:tcPr>
+            <w:tcW w:type="dxa" w:w="1606"/>
+          </w:tcPr>
+          <w:p>
+            <w:r>
+              <w:t xml:space="preserve">Критический</w:t>
+            </w:r>
+          </w:p>
+        </w:tc>
+        <w:tc>
+          <w:tcPr>
+            <w:tcW w:type="dxa" w:w="1606"/>
+          </w:tcPr>
+          <w:p>
+            <w:r>
+              <w:t xml:space="preserve">Первый</w:t>
+            </w:r>
+          </w:p>
+        </w:tc>
+      </w:tr>
+      <w:tr>
+        <w:tc>
+          <w:tcPr>
+            <w:tcW w:type="dxa" w:w="1606"/>
+          </w:tcPr>
+          <w:p>
+            <w:r>
+              <w:t xml:space="preserve">Экран тарифов/оплаты</w:t>
+            </w:r>
+          </w:p>
+        </w:tc>
+        <w:tc>
+          <w:tcPr>
+            <w:tcW w:type="dxa" w:w="1606"/>
+          </w:tcPr>
+          <w:p>
+            <w:r>
+              <w:t xml:space="preserve">Средняя (не создаёт ценность сама по себе)</w:t>
+            </w:r>
+          </w:p>
+        </w:tc>
+        <w:tc>
+          <w:tcPr>
+            <w:tcW w:type="dxa" w:w="1606"/>
+          </w:tcPr>
+          <w:p>
+            <w:r>
+              <w:rPr>
+                <w:b/>
+                <w:bCs/>
+              </w:rPr>
+              <w:t xml:space="preserve">Прямая, единственная точка монетизации</w:t>
+            </w:r>
+          </w:p>
+        </w:tc>
+        <w:tc>
+          <w:tcPr>
+            <w:tcW w:type="dxa" w:w="1606"/>
+          </w:tcPr>
+          <w:p>
+            <w:r>
+              <w:t xml:space="preserve">Низкая</w:t>
+            </w:r>
+          </w:p>
+        </w:tc>
+        <w:tc>
+          <w:tcPr>
+            <w:tcW w:type="dxa" w:w="1606"/>
+          </w:tcPr>
+          <w:p>
+            <w:r>
+              <w:t xml:space="preserve">Высокий — без неё нельзя проверить готовность платить</w:t>
+            </w:r>
+          </w:p>
+        </w:tc>
+        <w:tc>
+          <w:tcPr>
+            <w:tcW w:type="dxa" w:w="1606"/>
+          </w:tcPr>
+          <w:p>
+            <w:r>
+              <w:t xml:space="preserve">Первый</w:t>
+            </w:r>
+          </w:p>
+        </w:tc>
+      </w:tr>
+      <w:tr>
+        <w:tc>
+          <w:tcPr>
+            <w:tcW w:type="dxa" w:w="1606"/>
+          </w:tcPr>
+          <w:p>
+            <w:r>
+              <w:t xml:space="preserve">Совместное редактирование (WebSocket)</w:t>
+            </w:r>
+          </w:p>
+        </w:tc>
+        <w:tc>
+          <w:tcPr>
+            <w:tcW w:type="dxa" w:w="1606"/>
+          </w:tcPr>
+          <w:p>
+            <w:r>
+              <w:t xml:space="preserve">Высокая для командного сценария</w:t>
+            </w:r>
+          </w:p>
+        </w:tc>
+        <w:tc>
+          <w:tcPr>
+            <w:tcW w:type="dxa" w:w="1606"/>
+          </w:tcPr>
+          <w:p>
+            <w:r>
+              <w:t xml:space="preserve">Косвенная (доп. места)</w:t>
+            </w:r>
+          </w:p>
+        </w:tc>
+        <w:tc>
+          <w:tcPr>
+            <w:tcW w:type="dxa" w:w="1606"/>
+          </w:tcPr>
+          <w:p>
+            <w:r>
+              <w:t xml:space="preserve">Высокая (требует синхронизации состояния)</w:t>
+            </w:r>
+          </w:p>
+        </w:tc>
+        <w:tc>
+          <w:tcPr>
+            <w:tcW w:type="dxa" w:w="1606"/>
+          </w:tcPr>
+          <w:p>
+            <w:r>
+              <w:t xml:space="preserve">Средний — можно проверить спрос и без этого в первом релизе</w:t>
+            </w:r>
+          </w:p>
+        </w:tc>
+        <w:tc>
+          <w:tcPr>
+            <w:tcW w:type="dxa" w:w="1606"/>
+          </w:tcPr>
+          <w:p>
+            <w:r>
+              <w:t xml:space="preserve">Второй</w:t>
+            </w:r>
+          </w:p>
+        </w:tc>
+      </w:tr>
+      <w:tr>
+        <w:tc>
+          <w:tcPr>
+            <w:tcW w:type="dxa" w:w="1606"/>
+          </w:tcPr>
+          <w:p>
+            <w:r>
+              <w:t xml:space="preserve">Полный охват нотаций (UML/IDEF/BPMN/сети Петри)</w:t>
+            </w:r>
+          </w:p>
+        </w:tc>
+        <w:tc>
+          <w:tcPr>
+            <w:tcW w:type="dxa" w:w="1606"/>
+          </w:tcPr>
+          <w:p>
+            <w:r>
+              <w:t xml:space="preserve">Высокая (ключевая дифференциация по ЛР5)</w:t>
+            </w:r>
+          </w:p>
+        </w:tc>
+        <w:tc>
+          <w:tcPr>
+            <w:tcW w:type="dxa" w:w="1606"/>
+          </w:tcPr>
+          <w:p>
+            <w:r>
+              <w:t xml:space="preserve">Косвенная</w:t>
+            </w:r>
+          </w:p>
+        </w:tc>
+        <w:tc>
+          <w:tcPr>
+            <w:tcW w:type="dxa" w:w="1606"/>
+          </w:tcPr>
+          <w:p>
+            <w:r>
+              <w:t xml:space="preserve">Очень высокая (годы разработки по волнам)</w:t>
+            </w:r>
+          </w:p>
+        </w:tc>
+        <w:tc>
+          <w:tcPr>
+            <w:tcW w:type="dxa" w:w="1606"/>
+          </w:tcPr>
+          <w:p>
+            <w:r>
+              <w:t xml:space="preserve">Низкий в моменте — дифференциация нужна для роста, не для проверки самой идеи</w:t>
+            </w:r>
+          </w:p>
+        </w:tc>
+        <w:tc>
+          <w:tcPr>
+            <w:tcW w:type="dxa" w:w="1606"/>
+          </w:tcPr>
+          <w:p>
+            <w:r>
+              <w:t xml:space="preserve">2–4</w:t>
             </w:r>
           </w:p>
         </w:tc>

</xml_diff>